<commit_message>
Site updated: 2022-03-14 12:39:15
</commit_message>
<xml_diff>
--- a/treasure/download/经藏/阿含部-155部/新建文件夹/佛说古来世时经--.docx
+++ b/treasure/download/经藏/阿含部-155部/新建文件夹/佛说古来世时经--.docx
@@ -77,23 +77,7 @@
           <w:szCs w:val="24"/>
           <w:shd w:val="pct15" w:color="auto" w:fill="FFFFFF"/>
         </w:rPr>
-        <w:t>于时贤者阿难律在彼会中。闻说法言。答报之曰。何但百千。正使过此无极之宝。犹不及长者供养饭食真戒比丘。所以者何。忆念吾昔在波罗奈国。谷米踊贵人民饥馑。我负担草卖以自活。彼有缘觉名曰和里。来游其国。我早出城欲担负草。尔时缘觉著衣持钵入城分卫。中道吾负草还于城门中。复与相遇。空钵而出。和里缘觉遥见吾来。即自念言。吾早入城。此人出城。今负草还。想朝未食。吾当随后往诣其家。乞可以适饥。我时担草自还其舍。下草著地。顾见缘觉追吾之后如影随形。我时心念。朝出城时见此缘觉入城分卫而空钵还。想未获食。吾当断食以奉施之。即持食出</w:t>
-      </w:r>
-      <w:r>
-        <w:rPr>
-          <w:sz w:val="24"/>
-          <w:szCs w:val="24"/>
-          <w:shd w:val="pct15" w:color="auto" w:fill="FFFFFF"/>
-        </w:rPr>
-        <w:t>长跪授之。身安隐具。愿上道人愍伤受之。时缘觉曰。谷米饥贵人民虚饥。分为二分。一分著钵一分自食。尔为应法耳。身报之曰。唯然圣人。白衣居家炊作器物。食具有耳。徐炊食之。早晚无在。道人愿受加哀一门。时彼缘觉悉受饭食。吾因是德。七反生天为诸天王。七反在世人中之尊。因此一施。为诸国王长者人民群臣百官所见奉事。四辈弟子比丘比丘尼清信士女所见供养。衣被饮食床褥卧具病瘦医药。自来求吾。吾无所望。初生在家为释种子。诸藏踊出金银珍宝不可胜计。及余财物无能限者。弃家损业行作沙门。假使尔时知其道人缘觉道成。广大其心福不可量。于是颂</w:t>
-      </w:r>
-      <w:r>
-        <w:rPr>
-          <w:sz w:val="24"/>
-          <w:szCs w:val="24"/>
-          <w:shd w:val="pct15" w:color="auto" w:fill="FFFFFF"/>
-        </w:rPr>
-        <w:t>曰。</w:t>
+        <w:t>于时贤者阿难律在彼会中。闻说法言。答报之曰。何但百千。正使过此无极之宝。犹不及长者供养饭食真戒比丘。所以者何。忆念吾昔在波罗奈国。谷米踊贵人民饥馑。我负担草卖以自活。彼有缘觉名曰和里。来游其国。我早出城欲担负草。尔时缘觉著衣持钵入城分卫。中道吾负草还于城门中。复与相遇。空钵而出。和里缘觉遥见吾来。即自念言。吾早入城。此人出城。今负草还。想朝未食。吾当随后往诣其家。乞可以适饥。我时担草自还其舍。下草著地。顾见缘觉追吾之后如影随形。我时心念。朝出城时见此缘觉入城分卫而空钵还。想未获食。吾当断食以奉施之。即持食出长跪授之。身安隐具。愿上道人愍伤受之。时缘觉曰。谷米饥贵人民虚饥。分为二分。一分著钵一分自食。尔为应法耳。身报之曰。唯然圣人。白衣居家炊作器物。食具有耳。徐炊食之。早晚无在。道人愿受加哀一门。时彼缘觉悉受饭食。吾因是德。七反生天为诸天王。七反在世人中之尊。因此一施。为诸国王长者人民群臣百官所见奉事。四辈弟子比丘比丘尼清信士女所见供养。衣被饮食床褥卧具病瘦医药。自来求吾。吾无所望。初生在家为释种子。诸藏踊出金银珍宝不可胜计。及余财物无能限者。弃家损业行作沙门。假使尔时知其道人缘觉道成。广大其心福不可量。于是颂曰。</w:t>
       </w:r>
     </w:p>
     <w:p>
@@ -264,15 +248,7 @@
           <w:szCs w:val="24"/>
           <w:shd w:val="pct15" w:color="auto" w:fill="FFFFFF"/>
         </w:rPr>
-        <w:t xml:space="preserve">　　亦不乐于生　　亦不乐求死。初不择其时　</w:t>
-      </w:r>
-      <w:r>
-        <w:rPr>
-          <w:sz w:val="24"/>
-          <w:szCs w:val="24"/>
-          <w:shd w:val="pct15" w:color="auto" w:fill="FFFFFF"/>
-        </w:rPr>
-        <w:t xml:space="preserve">　寂然定其志。</w:t>
+        <w:t xml:space="preserve">　　亦不乐于生　　亦不乐求死。初不择其时　　寂然定其志。</w:t>
       </w:r>
     </w:p>
     <w:p>
@@ -432,15 +408,7 @@
           <w:szCs w:val="24"/>
           <w:shd w:val="pct15" w:color="auto" w:fill="FFFFFF"/>
         </w:rPr>
-        <w:t>佛言。当来之世。人当长命寿八万岁。此阎浮提人民炽盛五谷丰贱。人聚落居鸡鸣相闻。女人五百岁乃行嫁</w:t>
-      </w:r>
-      <w:r>
-        <w:rPr>
-          <w:sz w:val="24"/>
-          <w:szCs w:val="24"/>
-          <w:shd w:val="pct15" w:color="auto" w:fill="FFFFFF"/>
-        </w:rPr>
-        <w:t>耳。都有三病老病大小便。有所思求。尔时有王号曰为轲。主四天下为转轮圣王。治以正法。自然七宝金轮白象绀马明珠玉女之妇藏臣</w:t>
+        <w:t>佛言。当来之世。人当长命寿八万岁。此阎浮提人民炽盛五谷丰贱。人聚落居鸡鸣相闻。女人五百岁乃行嫁耳。都有三病老病大小便。有所思求。尔时有王号曰为轲。主四天下为转轮圣王。治以正法。自然七宝金轮白象绀马明珠玉女之妇藏臣</w:t>
       </w:r>
       <w:r>
         <w:rPr>
@@ -469,15 +437,7 @@
           <w:szCs w:val="24"/>
           <w:shd w:val="pct15" w:color="auto" w:fill="FFFFFF"/>
         </w:rPr>
-        <w:t>尔时贤者比丘</w:t>
-      </w:r>
-      <w:r>
-        <w:rPr>
-          <w:sz w:val="24"/>
-          <w:szCs w:val="24"/>
-          <w:shd w:val="pct15" w:color="auto" w:fill="FFFFFF"/>
-        </w:rPr>
-        <w:t>在会中。即从坐起。偏袒右肩。长跪叉手白世尊曰。我当来世当为轲王乎。主四天下。自然七宝而有千子。治以正法。广施一切。出家学道成无著慧耶。</w:t>
+        <w:t>尔时贤者比丘在会中。即从坐起。偏袒右肩。长跪叉手白世尊曰。我当来世当为轲王乎。主四天下。自然七宝而有千子。治以正法。广施一切。出家学道成无著慧耶。</w:t>
       </w:r>
     </w:p>
     <w:p>
@@ -557,15 +517,7 @@
           <w:szCs w:val="24"/>
           <w:shd w:val="pct15" w:color="auto" w:fill="FFFFFF"/>
         </w:rPr>
-        <w:t>佛告比丘。后来世人其命增长八万岁。当有世尊号曰弥勒如来至真等正觉明行成为善逝世间解无上士道法御天人师号佛世尊。如我今也。天上天下诸天梵释。沙门梵志莫不归伏从受道教。普说法化。上中下善。分别其义。清</w:t>
-      </w:r>
-      <w:r>
-        <w:rPr>
-          <w:sz w:val="24"/>
-          <w:szCs w:val="24"/>
-          <w:shd w:val="pct15" w:color="auto" w:fill="FFFFFF"/>
-        </w:rPr>
-        <w:t>修梵行。普兴道化。犹如我今也。其清净教流布天上天下。莫不承受。其比丘众无央数千。</w:t>
+        <w:t>佛告比丘。后来世人其命增长八万岁。当有世尊号曰弥勒如来至真等正觉明行成为善逝世间解无上士道法御天人师号佛世尊。如我今也。天上天下诸天梵释。沙门梵志莫不归伏从受道教。普说法化。上中下善。分别其义。清修梵行。普兴道化。犹如我今也。其清净教流布天上天下。莫不承受。其比丘众无央数千。</w:t>
       </w:r>
     </w:p>
     <w:p>
@@ -725,7 +677,53 @@
           <w:szCs w:val="24"/>
           <w:shd w:val="pct15" w:color="auto" w:fill="FFFFFF"/>
         </w:rPr>
-        <w:t>尔时世人民　　无著狐疑断。蠲除生死网　　事办无穿漏。</w:t>
+        <w:t>尔时世人民</w:t>
+      </w:r>
+      <w:r>
+        <w:rPr>
+          <w:rFonts w:hint="eastAsia"/>
+          <w:sz w:val="24"/>
+          <w:szCs w:val="24"/>
+          <w:shd w:val="pct15" w:color="auto" w:fill="FFFFFF"/>
+          <w:lang w:eastAsia="zh-CN"/>
+        </w:rPr>
+        <w:t>。</w:t>
+      </w:r>
+      <w:r>
+        <w:rPr>
+          <w:sz w:val="24"/>
+          <w:szCs w:val="24"/>
+          <w:shd w:val="pct15" w:color="auto" w:fill="FFFFFF"/>
+        </w:rPr>
+        <w:t>无著狐疑断。</w:t>
+      </w:r>
+      <w:bookmarkStart w:id="0" w:name="_GoBack"/>
+      <w:bookmarkEnd w:id="0"/>
+      <w:r>
+        <w:rPr>
+          <w:sz w:val="24"/>
+          <w:szCs w:val="24"/>
+          <w:shd w:val="pct15" w:color="auto" w:fill="FFFFFF"/>
+        </w:rPr>
+        <w:t>蠲除生死网</w:t>
+      </w:r>
+      <w:r>
+        <w:rPr>
+          <w:rFonts w:hint="eastAsia"/>
+          <w:sz w:val="24"/>
+          <w:szCs w:val="24"/>
+          <w:shd w:val="pct15" w:color="auto" w:fill="FFFFFF"/>
+          <w:lang w:eastAsia="zh-CN"/>
+        </w:rPr>
+        <w:t>。</w:t>
+      </w:r>
+      <w:r>
+        <w:rPr>
+          <w:sz w:val="24"/>
+          <w:szCs w:val="24"/>
+          <w:shd w:val="pct15" w:color="auto" w:fill="FFFFFF"/>
+        </w:rPr>
+        <w:t>事办无穿漏。</w:t>
       </w:r>
     </w:p>
     <w:p>
@@ -745,7 +743,25 @@
           <w:szCs w:val="24"/>
           <w:shd w:val="pct15" w:color="auto" w:fill="FFFFFF"/>
         </w:rPr>
-        <w:t>于弥勒佛教　　净修于梵行。</w:t>
+        <w:t>于弥勒佛教</w:t>
+      </w:r>
+      <w:r>
+        <w:rPr>
+          <w:rFonts w:hint="eastAsia"/>
+          <w:sz w:val="24"/>
+          <w:szCs w:val="24"/>
+          <w:shd w:val="pct15" w:color="auto" w:fill="FFFFFF"/>
+          <w:lang w:eastAsia="zh-CN"/>
+        </w:rPr>
+        <w:t>。</w:t>
+      </w:r>
+      <w:r>
+        <w:rPr>
+          <w:sz w:val="24"/>
+          <w:szCs w:val="24"/>
+          <w:shd w:val="pct15" w:color="auto" w:fill="FFFFFF"/>
+        </w:rPr>
+        <w:t>净修于梵行。</w:t>
       </w:r>
     </w:p>
     <w:p>
@@ -785,23 +801,7 @@
           <w:szCs w:val="24"/>
           <w:shd w:val="pct15" w:color="auto" w:fill="FFFFFF"/>
         </w:rPr>
-        <w:t xml:space="preserve">我想尔时人　　</w:t>
-      </w:r>
-      <w:r>
-        <w:rPr>
-          <w:sz w:val="24"/>
-          <w:szCs w:val="24"/>
-          <w:shd w:val="pct15" w:color="auto" w:fill="FFFFFF"/>
-        </w:rPr>
-        <w:t>体衣文鲜明。栴檀</w:t>
-      </w:r>
-      <w:r>
-        <w:rPr>
-          <w:sz w:val="24"/>
-          <w:szCs w:val="24"/>
-          <w:shd w:val="pct15" w:color="auto" w:fill="FFFFFF"/>
-        </w:rPr>
-        <w:t>以涂身　　庄严其身首。</w:t>
+        <w:t>我想尔时人　　体衣文鲜明。栴檀以涂身　　庄严其身首。</w:t>
       </w:r>
     </w:p>
     <w:p>
@@ -981,17 +981,7 @@
           <w:szCs w:val="24"/>
           <w:shd w:val="pct15" w:color="auto" w:fill="FFFFFF"/>
         </w:rPr>
-        <w:t>彼人度无极　　坏网无所拘。</w:t>
-      </w:r>
-      <w:bookmarkStart w:id="0" w:name="_GoBack"/>
-      <w:bookmarkEnd w:id="0"/>
-      <w:r>
-        <w:rPr>
-          <w:sz w:val="24"/>
-          <w:szCs w:val="24"/>
-          <w:shd w:val="pct15" w:color="auto" w:fill="FFFFFF"/>
-        </w:rPr>
-        <w:t>禅定行平等　　欣然无所著。</w:t>
+        <w:t>彼人度无极　　坏网无所拘。禅定行平等　　欣然无所著。</w:t>
       </w:r>
     </w:p>
     <w:p>
@@ -12993,7 +12983,7 @@
 </file>
 
 <file path=customXml/itemProps1.xml><?xml version="1.0" encoding="utf-8"?>
-<ds:datastoreItem xmlns:ds="http://schemas.openxmlformats.org/officeDocument/2006/customXml" ds:itemID="{BA7F34F2-CC8A-4DA5-A7B0-F90C1CFB5EC5}">
+<ds:datastoreItem xmlns:ds="http://schemas.openxmlformats.org/officeDocument/2006/customXml" ds:itemID="{2B7A2D73-BBDE-4AE7-846F-6741D310E897}">
   <ds:schemaRefs>
     <ds:schemaRef ds:uri="http://schemas.openxmlformats.org/officeDocument/2006/bibliography"/>
   </ds:schemaRefs>

</xml_diff>